<commit_message>
Implementa calificación documental v3.2 y elimina resaltado amarillo
</commit_message>
<xml_diff>
--- a/templates/seguridad_medicion_v3.docx
+++ b/templates/seguridad_medicion_v3.docx
@@ -113,6 +113,91 @@
               <w:color w:val="92D050"/>
             </w:rPr>
           </w:pPr>
+        </w:p>
+        <w:p>
+          <w:pPr>
+            <w:spacing w:before="320" w:after="320" w:line="360" w:lineRule="auto"/>
+            <w:ind w:left="567" w:right="616" w:firstLine="284"/>
+            <w:contextualSpacing/>
+            <w:jc w:val="both"/>
+            <w:rPr>
+              <w:rFonts w:ascii="Archivo Light" w:hAnsi="Archivo Light" w:cs="Archivo Light"/>
+            </w:rPr>
+          </w:pPr>
+          <w:r>
+            <w:rPr>
+              <w:rFonts w:ascii="Archivo Light" w:hAnsi="Archivo Light" w:cs="Archivo Light"/>
+            </w:rPr>
+            <w:t>{metodologia_calificacion}</w:t>
+          </w:r>
+        </w:p>
+        <w:p>
+          <w:pPr>
+            <w:spacing w:before="320" w:after="320" w:line="360" w:lineRule="auto"/>
+            <w:ind w:left="567" w:right="616" w:firstLine="284"/>
+            <w:contextualSpacing/>
+            <w:jc w:val="both"/>
+            <w:rPr>
+              <w:rFonts w:ascii="Archivo Light" w:hAnsi="Archivo Light" w:cs="Archivo Light"/>
+            </w:rPr>
+          </w:pPr>
+          <w:r>
+            <w:rPr>
+              <w:rFonts w:ascii="Archivo Light" w:hAnsi="Archivo Light" w:cs="Archivo Light"/>
+            </w:rPr>
+            <w:t>{cobertura_general}</w:t>
+          </w:r>
+        </w:p>
+        <w:p>
+          <w:pPr>
+            <w:spacing w:before="320" w:after="320" w:line="360" w:lineRule="auto"/>
+            <w:ind w:left="567" w:right="616" w:firstLine="284"/>
+            <w:contextualSpacing/>
+            <w:jc w:val="both"/>
+            <w:rPr>
+              <w:rFonts w:ascii="Archivo Light" w:hAnsi="Archivo Light" w:cs="Archivo Light"/>
+            </w:rPr>
+          </w:pPr>
+          <w:r>
+            <w:rPr>
+              <w:rFonts w:ascii="Archivo Light" w:hAnsi="Archivo Light" w:cs="Archivo Light"/>
+            </w:rPr>
+            <w:t>{cobertura_ultimo_periodo}</w:t>
+          </w:r>
+        </w:p>
+        <w:p>
+          <w:pPr>
+            <w:spacing w:before="320" w:after="320" w:line="360" w:lineRule="auto"/>
+            <w:ind w:left="567" w:right="616" w:firstLine="284"/>
+            <w:contextualSpacing/>
+            <w:jc w:val="both"/>
+            <w:rPr>
+              <w:rFonts w:ascii="Archivo Light" w:hAnsi="Archivo Light" w:cs="Archivo Light"/>
+            </w:rPr>
+          </w:pPr>
+          <w:r>
+            <w:rPr>
+              <w:rFonts w:ascii="Archivo Light" w:hAnsi="Archivo Light" w:cs="Archivo Light"/>
+            </w:rPr>
+            <w:t>{sensibilidad_general}</w:t>
+          </w:r>
+        </w:p>
+        <w:p>
+          <w:pPr>
+            <w:spacing w:before="320" w:after="320" w:line="360" w:lineRule="auto"/>
+            <w:ind w:left="567" w:right="616" w:firstLine="284"/>
+            <w:contextualSpacing/>
+            <w:jc w:val="both"/>
+            <w:rPr>
+              <w:rFonts w:ascii="Archivo Light" w:hAnsi="Archivo Light" w:cs="Archivo Light"/>
+            </w:rPr>
+          </w:pPr>
+          <w:r>
+            <w:rPr>
+              <w:rFonts w:ascii="Archivo Light" w:hAnsi="Archivo Light" w:cs="Archivo Light"/>
+            </w:rPr>
+            <w:t>{sensibilidad_ultimo_periodo}</w:t>
+          </w:r>
         </w:p>
       </w:sdtContent>
     </w:sdt>
@@ -992,6 +1077,40 @@
             <w:rPr>
               <w:rFonts w:ascii="Archivo Light" w:hAnsi="Archivo Light" w:cs="Archivo Light"/>
             </w:rPr>
+            <w:t>{calificacion_indicador_01_general}</w:t>
+          </w:r>
+        </w:p>
+        <w:p>
+          <w:pPr>
+            <w:spacing w:before="320" w:after="320" w:line="360" w:lineRule="auto"/>
+            <w:ind w:left="567" w:right="616" w:firstLine="284"/>
+            <w:contextualSpacing/>
+            <w:jc w:val="both"/>
+            <w:rPr>
+              <w:rFonts w:ascii="Archivo Light" w:hAnsi="Archivo Light" w:cs="Archivo Light"/>
+            </w:rPr>
+          </w:pPr>
+          <w:r>
+            <w:rPr>
+              <w:rFonts w:ascii="Archivo Light" w:hAnsi="Archivo Light" w:cs="Archivo Light"/>
+            </w:rPr>
+            <w:t>{calificacion_indicador_01_ultimo_periodo}</w:t>
+          </w:r>
+        </w:p>
+        <w:p>
+          <w:pPr>
+            <w:spacing w:before="320" w:after="320" w:line="360" w:lineRule="auto"/>
+            <w:ind w:left="567" w:right="616" w:firstLine="284"/>
+            <w:contextualSpacing/>
+            <w:jc w:val="both"/>
+            <w:rPr>
+              <w:rFonts w:ascii="Archivo Light" w:hAnsi="Archivo Light" w:cs="Archivo Light"/>
+            </w:rPr>
+          </w:pPr>
+          <w:r>
+            <w:rPr>
+              <w:rFonts w:ascii="Archivo Light" w:hAnsi="Archivo Light" w:cs="Archivo Light"/>
+            </w:rPr>
             <w:t>{analisis_indicador_01}</w:t>
           </w:r>
         </w:p>
@@ -1167,6 +1286,40 @@
             <w:rPr>
               <w:rFonts w:ascii="Archivo Light" w:hAnsi="Archivo Light" w:cs="Archivo Light"/>
             </w:rPr>
+            <w:t>{calificacion_indicador_02_general}</w:t>
+          </w:r>
+        </w:p>
+        <w:p>
+          <w:pPr>
+            <w:spacing w:before="320" w:after="320" w:line="360" w:lineRule="auto"/>
+            <w:ind w:left="567" w:right="616" w:firstLine="284"/>
+            <w:contextualSpacing/>
+            <w:jc w:val="both"/>
+            <w:rPr>
+              <w:rFonts w:ascii="Archivo Light" w:hAnsi="Archivo Light" w:cs="Archivo Light"/>
+            </w:rPr>
+          </w:pPr>
+          <w:r>
+            <w:rPr>
+              <w:rFonts w:ascii="Archivo Light" w:hAnsi="Archivo Light" w:cs="Archivo Light"/>
+            </w:rPr>
+            <w:t>{calificacion_indicador_02_ultimo_periodo}</w:t>
+          </w:r>
+        </w:p>
+        <w:p>
+          <w:pPr>
+            <w:spacing w:before="320" w:after="320" w:line="360" w:lineRule="auto"/>
+            <w:ind w:left="567" w:right="616" w:firstLine="284"/>
+            <w:contextualSpacing/>
+            <w:jc w:val="both"/>
+            <w:rPr>
+              <w:rFonts w:ascii="Archivo Light" w:hAnsi="Archivo Light" w:cs="Archivo Light"/>
+            </w:rPr>
+          </w:pPr>
+          <w:r>
+            <w:rPr>
+              <w:rFonts w:ascii="Archivo Light" w:hAnsi="Archivo Light" w:cs="Archivo Light"/>
+            </w:rPr>
             <w:t>{analisis_indicador_02}</w:t>
           </w:r>
         </w:p>
@@ -1320,6 +1473,40 @@
             <w:rPr>
               <w:rFonts w:ascii="Archivo Light" w:hAnsi="Archivo Light" w:cs="Archivo Light"/>
             </w:rPr>
+            <w:t>{calificacion_indicador_03_general}</w:t>
+          </w:r>
+        </w:p>
+        <w:p>
+          <w:pPr>
+            <w:pStyle w:val="Prrafodelista"/>
+            <w:spacing w:before="280" w:after="280" w:line="240" w:lineRule="auto"/>
+            <w:ind w:left="714"/>
+            <w:jc w:val="both"/>
+            <w:rPr>
+              <w:rFonts w:ascii="Archivo Light" w:hAnsi="Archivo Light" w:cs="Archivo Light"/>
+            </w:rPr>
+          </w:pPr>
+          <w:r>
+            <w:rPr>
+              <w:rFonts w:ascii="Archivo Light" w:hAnsi="Archivo Light" w:cs="Archivo Light"/>
+            </w:rPr>
+            <w:t>{calificacion_indicador_03_ultimo_periodo}</w:t>
+          </w:r>
+        </w:p>
+        <w:p>
+          <w:pPr>
+            <w:pStyle w:val="Prrafodelista"/>
+            <w:spacing w:before="280" w:after="280" w:line="240" w:lineRule="auto"/>
+            <w:ind w:left="714"/>
+            <w:jc w:val="both"/>
+            <w:rPr>
+              <w:rFonts w:ascii="Archivo Light" w:hAnsi="Archivo Light" w:cs="Archivo Light"/>
+            </w:rPr>
+          </w:pPr>
+          <w:r>
+            <w:rPr>
+              <w:rFonts w:ascii="Archivo Light" w:hAnsi="Archivo Light" w:cs="Archivo Light"/>
+            </w:rPr>
             <w:t>{analisis_indicador_03}</w:t>
           </w:r>
         </w:p>
@@ -1697,6 +1884,40 @@
             <w:rPr>
               <w:rFonts w:ascii="Archivo Light" w:hAnsi="Archivo Light" w:cs="Archivo Light"/>
             </w:rPr>
+            <w:t>{calificacion_indicador_04_general}</w:t>
+          </w:r>
+        </w:p>
+        <w:p>
+          <w:pPr>
+            <w:spacing w:before="320" w:after="320" w:line="360" w:lineRule="auto"/>
+            <w:ind w:left="567" w:right="616" w:firstLine="284"/>
+            <w:contextualSpacing/>
+            <w:jc w:val="both"/>
+            <w:rPr>
+              <w:rFonts w:ascii="Archivo Light" w:hAnsi="Archivo Light" w:cs="Archivo Light"/>
+            </w:rPr>
+          </w:pPr>
+          <w:r>
+            <w:rPr>
+              <w:rFonts w:ascii="Archivo Light" w:hAnsi="Archivo Light" w:cs="Archivo Light"/>
+            </w:rPr>
+            <w:t>{calificacion_indicador_04_ultimo_periodo}</w:t>
+          </w:r>
+        </w:p>
+        <w:p>
+          <w:pPr>
+            <w:spacing w:before="320" w:after="320" w:line="360" w:lineRule="auto"/>
+            <w:ind w:left="567" w:right="616" w:firstLine="284"/>
+            <w:contextualSpacing/>
+            <w:jc w:val="both"/>
+            <w:rPr>
+              <w:rFonts w:ascii="Archivo Light" w:hAnsi="Archivo Light" w:cs="Archivo Light"/>
+            </w:rPr>
+          </w:pPr>
+          <w:r>
+            <w:rPr>
+              <w:rFonts w:ascii="Archivo Light" w:hAnsi="Archivo Light" w:cs="Archivo Light"/>
+            </w:rPr>
             <w:t>{analisis_indicador_04}</w:t>
           </w:r>
         </w:p>
@@ -1822,6 +2043,40 @@
             <w:rPr>
               <w:rFonts w:ascii="Archivo Light" w:hAnsi="Archivo Light" w:cs="Archivo Light"/>
             </w:rPr>
+            <w:t>{calificacion_indicador_05_general}</w:t>
+          </w:r>
+        </w:p>
+        <w:p>
+          <w:pPr>
+            <w:spacing w:before="320" w:after="320" w:line="360" w:lineRule="auto"/>
+            <w:ind w:left="567" w:right="616" w:firstLine="284"/>
+            <w:contextualSpacing/>
+            <w:jc w:val="both"/>
+            <w:rPr>
+              <w:rFonts w:ascii="Archivo Light" w:hAnsi="Archivo Light" w:cs="Archivo Light"/>
+            </w:rPr>
+          </w:pPr>
+          <w:r>
+            <w:rPr>
+              <w:rFonts w:ascii="Archivo Light" w:hAnsi="Archivo Light" w:cs="Archivo Light"/>
+            </w:rPr>
+            <w:t>{calificacion_indicador_05_ultimo_periodo}</w:t>
+          </w:r>
+        </w:p>
+        <w:p>
+          <w:pPr>
+            <w:spacing w:before="320" w:after="320" w:line="360" w:lineRule="auto"/>
+            <w:ind w:left="567" w:right="616" w:firstLine="284"/>
+            <w:contextualSpacing/>
+            <w:jc w:val="both"/>
+            <w:rPr>
+              <w:rFonts w:ascii="Archivo Light" w:hAnsi="Archivo Light" w:cs="Archivo Light"/>
+            </w:rPr>
+          </w:pPr>
+          <w:r>
+            <w:rPr>
+              <w:rFonts w:ascii="Archivo Light" w:hAnsi="Archivo Light" w:cs="Archivo Light"/>
+            </w:rPr>
             <w:t>{analisis_indicador_05}</w:t>
           </w:r>
         </w:p>
@@ -1939,6 +2194,40 @@
             <w:rPr>
               <w:rFonts w:ascii="Archivo Light" w:hAnsi="Archivo Light" w:cs="Archivo Light"/>
             </w:rPr>
+            <w:t>{calificacion_indicador_06_general}</w:t>
+          </w:r>
+        </w:p>
+        <w:p>
+          <w:pPr>
+            <w:spacing w:before="320" w:after="320" w:line="360" w:lineRule="auto"/>
+            <w:ind w:left="567" w:right="616" w:firstLine="284"/>
+            <w:contextualSpacing/>
+            <w:jc w:val="both"/>
+            <w:rPr>
+              <w:rFonts w:ascii="Archivo Light" w:hAnsi="Archivo Light" w:cs="Archivo Light"/>
+            </w:rPr>
+          </w:pPr>
+          <w:r>
+            <w:rPr>
+              <w:rFonts w:ascii="Archivo Light" w:hAnsi="Archivo Light" w:cs="Archivo Light"/>
+            </w:rPr>
+            <w:t>{calificacion_indicador_06_ultimo_periodo}</w:t>
+          </w:r>
+        </w:p>
+        <w:p>
+          <w:pPr>
+            <w:spacing w:before="320" w:after="320" w:line="360" w:lineRule="auto"/>
+            <w:ind w:left="567" w:right="616" w:firstLine="284"/>
+            <w:contextualSpacing/>
+            <w:jc w:val="both"/>
+            <w:rPr>
+              <w:rFonts w:ascii="Archivo Light" w:hAnsi="Archivo Light" w:cs="Archivo Light"/>
+            </w:rPr>
+          </w:pPr>
+          <w:r>
+            <w:rPr>
+              <w:rFonts w:ascii="Archivo Light" w:hAnsi="Archivo Light" w:cs="Archivo Light"/>
+            </w:rPr>
             <w:t>{analisis_indicador_06}</w:t>
           </w:r>
         </w:p>
@@ -2048,6 +2337,40 @@
             <w:rPr>
               <w:rFonts w:ascii="Archivo Light" w:hAnsi="Archivo Light" w:cs="Archivo Light"/>
             </w:rPr>
+            <w:t>{calificacion_indicador_07_general}</w:t>
+          </w:r>
+        </w:p>
+        <w:p>
+          <w:pPr>
+            <w:spacing w:before="320" w:after="320" w:line="360" w:lineRule="auto"/>
+            <w:ind w:left="567" w:right="616" w:firstLine="284"/>
+            <w:contextualSpacing/>
+            <w:jc w:val="both"/>
+            <w:rPr>
+              <w:rFonts w:ascii="Archivo Light" w:hAnsi="Archivo Light" w:cs="Archivo Light"/>
+            </w:rPr>
+          </w:pPr>
+          <w:r>
+            <w:rPr>
+              <w:rFonts w:ascii="Archivo Light" w:hAnsi="Archivo Light" w:cs="Archivo Light"/>
+            </w:rPr>
+            <w:t>{calificacion_indicador_07_ultimo_periodo}</w:t>
+          </w:r>
+        </w:p>
+        <w:p>
+          <w:pPr>
+            <w:spacing w:before="320" w:after="320" w:line="360" w:lineRule="auto"/>
+            <w:ind w:left="567" w:right="616" w:firstLine="284"/>
+            <w:contextualSpacing/>
+            <w:jc w:val="both"/>
+            <w:rPr>
+              <w:rFonts w:ascii="Archivo Light" w:hAnsi="Archivo Light" w:cs="Archivo Light"/>
+            </w:rPr>
+          </w:pPr>
+          <w:r>
+            <w:rPr>
+              <w:rFonts w:ascii="Archivo Light" w:hAnsi="Archivo Light" w:cs="Archivo Light"/>
+            </w:rPr>
             <w:t>{analisis_indicador_07}</w:t>
           </w:r>
         </w:p>
@@ -2166,6 +2489,42 @@
             <w:rPr>
               <w:rFonts w:ascii="Archivo Light" w:hAnsi="Archivo Light" w:cs="Archivo Light"/>
             </w:rPr>
+            <w:t>{calificacion_indicador_08_general}</w:t>
+          </w:r>
+        </w:p>
+        <w:p>
+          <w:pPr>
+            <w:spacing w:before="280" w:after="280" w:line="240" w:lineRule="auto"/>
+            <w:ind w:left="357"/>
+            <w:jc w:val="both"/>
+            <w:rPr>
+              <w:rFonts w:ascii="Archivo Light" w:hAnsi="Archivo Light" w:cs="Archivo Light"/>
+              <w:sz w:val="48"/>
+              <w:szCs w:val="48"/>
+            </w:rPr>
+          </w:pPr>
+          <w:r>
+            <w:rPr>
+              <w:rFonts w:ascii="Archivo Light" w:hAnsi="Archivo Light" w:cs="Archivo Light"/>
+            </w:rPr>
+            <w:t>{calificacion_indicador_08_ultimo_periodo}</w:t>
+          </w:r>
+        </w:p>
+        <w:p>
+          <w:pPr>
+            <w:spacing w:before="280" w:after="280" w:line="240" w:lineRule="auto"/>
+            <w:ind w:left="357"/>
+            <w:jc w:val="both"/>
+            <w:rPr>
+              <w:rFonts w:ascii="Archivo Light" w:hAnsi="Archivo Light" w:cs="Archivo Light"/>
+              <w:sz w:val="48"/>
+              <w:szCs w:val="48"/>
+            </w:rPr>
+          </w:pPr>
+          <w:r>
+            <w:rPr>
+              <w:rFonts w:ascii="Archivo Light" w:hAnsi="Archivo Light" w:cs="Archivo Light"/>
+            </w:rPr>
             <w:t>{analisis_indicador_08}</w:t>
           </w:r>
         </w:p>
@@ -2296,6 +2655,38 @@
             <w:rPr>
               <w:rFonts w:ascii="Archivo Light" w:hAnsi="Archivo Light" w:cs="Archivo Light"/>
             </w:rPr>
+            <w:t>{calificacion_indicador_09_general}</w:t>
+          </w:r>
+        </w:p>
+        <w:p>
+          <w:pPr>
+            <w:spacing w:before="320" w:after="320" w:line="360" w:lineRule="auto"/>
+            <w:ind w:right="618"/>
+            <w:jc w:val="both"/>
+            <w:rPr>
+              <w:rFonts w:ascii="Archivo Light" w:hAnsi="Archivo Light" w:cs="Archivo Light"/>
+            </w:rPr>
+          </w:pPr>
+          <w:r>
+            <w:rPr>
+              <w:rFonts w:ascii="Archivo Light" w:hAnsi="Archivo Light" w:cs="Archivo Light"/>
+            </w:rPr>
+            <w:t>{calificacion_indicador_09_ultimo_periodo}</w:t>
+          </w:r>
+        </w:p>
+        <w:p>
+          <w:pPr>
+            <w:spacing w:before="320" w:after="320" w:line="360" w:lineRule="auto"/>
+            <w:ind w:right="618"/>
+            <w:jc w:val="both"/>
+            <w:rPr>
+              <w:rFonts w:ascii="Archivo Light" w:hAnsi="Archivo Light" w:cs="Archivo Light"/>
+            </w:rPr>
+          </w:pPr>
+          <w:r>
+            <w:rPr>
+              <w:rFonts w:ascii="Archivo Light" w:hAnsi="Archivo Light" w:cs="Archivo Light"/>
+            </w:rPr>
             <w:t>{analisis_indicador_09}</w:t>
           </w:r>
         </w:p>
@@ -2401,6 +2792,38 @@
             <w:rPr>
               <w:rFonts w:ascii="Archivo Light" w:hAnsi="Archivo Light" w:cs="Archivo Light"/>
             </w:rPr>
+            <w:t>{calificacion_indicador_10_general}</w:t>
+          </w:r>
+        </w:p>
+        <w:p>
+          <w:pPr>
+            <w:spacing w:before="320" w:after="320" w:line="360" w:lineRule="auto"/>
+            <w:ind w:right="616"/>
+            <w:jc w:val="both"/>
+            <w:rPr>
+              <w:rFonts w:ascii="Archivo Light" w:hAnsi="Archivo Light" w:cs="Archivo Light"/>
+            </w:rPr>
+          </w:pPr>
+          <w:r>
+            <w:rPr>
+              <w:rFonts w:ascii="Archivo Light" w:hAnsi="Archivo Light" w:cs="Archivo Light"/>
+            </w:rPr>
+            <w:t>{calificacion_indicador_10_ultimo_periodo}</w:t>
+          </w:r>
+        </w:p>
+        <w:p>
+          <w:pPr>
+            <w:spacing w:before="320" w:after="320" w:line="360" w:lineRule="auto"/>
+            <w:ind w:right="616"/>
+            <w:jc w:val="both"/>
+            <w:rPr>
+              <w:rFonts w:ascii="Archivo Light" w:hAnsi="Archivo Light" w:cs="Archivo Light"/>
+            </w:rPr>
+          </w:pPr>
+          <w:r>
+            <w:rPr>
+              <w:rFonts w:ascii="Archivo Light" w:hAnsi="Archivo Light" w:cs="Archivo Light"/>
+            </w:rPr>
             <w:t>{analisis_indicador_10}</w:t>
           </w:r>
         </w:p>
@@ -2993,6 +3416,38 @@
             <w:rPr>
               <w:rFonts w:ascii="Archivo Light" w:hAnsi="Archivo Light" w:cs="Archivo Light"/>
             </w:rPr>
+            <w:t>{calificacion_indicador_11_general}</w:t>
+          </w:r>
+        </w:p>
+        <w:p>
+          <w:pPr>
+            <w:spacing w:before="320" w:after="320" w:line="360" w:lineRule="auto"/>
+            <w:ind w:right="616"/>
+            <w:jc w:val="both"/>
+            <w:rPr>
+              <w:rFonts w:ascii="Archivo Light" w:hAnsi="Archivo Light" w:cs="Archivo Light"/>
+            </w:rPr>
+          </w:pPr>
+          <w:r>
+            <w:rPr>
+              <w:rFonts w:ascii="Archivo Light" w:hAnsi="Archivo Light" w:cs="Archivo Light"/>
+            </w:rPr>
+            <w:t>{calificacion_indicador_11_ultimo_periodo}</w:t>
+          </w:r>
+        </w:p>
+        <w:p>
+          <w:pPr>
+            <w:spacing w:before="320" w:after="320" w:line="360" w:lineRule="auto"/>
+            <w:ind w:right="616"/>
+            <w:jc w:val="both"/>
+            <w:rPr>
+              <w:rFonts w:ascii="Archivo Light" w:hAnsi="Archivo Light" w:cs="Archivo Light"/>
+            </w:rPr>
+          </w:pPr>
+          <w:r>
+            <w:rPr>
+              <w:rFonts w:ascii="Archivo Light" w:hAnsi="Archivo Light" w:cs="Archivo Light"/>
+            </w:rPr>
             <w:t>{analisis_indicador_11}</w:t>
           </w:r>
         </w:p>
@@ -3117,6 +3572,38 @@
             <w:rPr>
               <w:rFonts w:ascii="Archivo Light" w:hAnsi="Archivo Light" w:cs="Archivo Light"/>
             </w:rPr>
+            <w:t>{calificacion_indicador_12_general}</w:t>
+          </w:r>
+        </w:p>
+        <w:p>
+          <w:pPr>
+            <w:spacing w:before="320" w:after="320" w:line="360" w:lineRule="auto"/>
+            <w:ind w:right="616"/>
+            <w:jc w:val="both"/>
+            <w:rPr>
+              <w:rFonts w:ascii="Archivo Light" w:hAnsi="Archivo Light" w:cs="Archivo Light"/>
+            </w:rPr>
+          </w:pPr>
+          <w:r>
+            <w:rPr>
+              <w:rFonts w:ascii="Archivo Light" w:hAnsi="Archivo Light" w:cs="Archivo Light"/>
+            </w:rPr>
+            <w:t>{calificacion_indicador_12_ultimo_periodo}</w:t>
+          </w:r>
+        </w:p>
+        <w:p>
+          <w:pPr>
+            <w:spacing w:before="320" w:after="320" w:line="360" w:lineRule="auto"/>
+            <w:ind w:right="616"/>
+            <w:jc w:val="both"/>
+            <w:rPr>
+              <w:rFonts w:ascii="Archivo Light" w:hAnsi="Archivo Light" w:cs="Archivo Light"/>
+            </w:rPr>
+          </w:pPr>
+          <w:r>
+            <w:rPr>
+              <w:rFonts w:ascii="Archivo Light" w:hAnsi="Archivo Light" w:cs="Archivo Light"/>
+            </w:rPr>
             <w:t>{analisis_indicador_12}</w:t>
           </w:r>
         </w:p>
@@ -3241,6 +3728,38 @@
             <w:rPr>
               <w:rFonts w:ascii="Archivo Light" w:hAnsi="Archivo Light" w:cs="Archivo Light"/>
             </w:rPr>
+            <w:t>{calificacion_indicador_13_general}</w:t>
+          </w:r>
+        </w:p>
+        <w:p>
+          <w:pPr>
+            <w:spacing w:before="320" w:after="320" w:line="360" w:lineRule="auto"/>
+            <w:ind w:left="57" w:right="616"/>
+            <w:jc w:val="both"/>
+            <w:rPr>
+              <w:rFonts w:ascii="Archivo Light" w:hAnsi="Archivo Light" w:cs="Archivo Light"/>
+            </w:rPr>
+          </w:pPr>
+          <w:r>
+            <w:rPr>
+              <w:rFonts w:ascii="Archivo Light" w:hAnsi="Archivo Light" w:cs="Archivo Light"/>
+            </w:rPr>
+            <w:t>{calificacion_indicador_13_ultimo_periodo}</w:t>
+          </w:r>
+        </w:p>
+        <w:p>
+          <w:pPr>
+            <w:spacing w:before="320" w:after="320" w:line="360" w:lineRule="auto"/>
+            <w:ind w:left="57" w:right="616"/>
+            <w:jc w:val="both"/>
+            <w:rPr>
+              <w:rFonts w:ascii="Archivo Light" w:hAnsi="Archivo Light" w:cs="Archivo Light"/>
+            </w:rPr>
+          </w:pPr>
+          <w:r>
+            <w:rPr>
+              <w:rFonts w:ascii="Archivo Light" w:hAnsi="Archivo Light" w:cs="Archivo Light"/>
+            </w:rPr>
             <w:t>{analisis_indicador_13}</w:t>
           </w:r>
         </w:p>
@@ -3346,6 +3865,38 @@
             <w:rPr>
               <w:rFonts w:ascii="Archivo Light" w:hAnsi="Archivo Light" w:cs="Archivo Light"/>
             </w:rPr>
+            <w:t>{calificacion_indicador_14_general}</w:t>
+          </w:r>
+        </w:p>
+        <w:p>
+          <w:pPr>
+            <w:spacing w:before="320" w:after="320" w:line="360" w:lineRule="auto"/>
+            <w:ind w:right="616"/>
+            <w:jc w:val="both"/>
+            <w:rPr>
+              <w:rFonts w:ascii="Archivo Light" w:hAnsi="Archivo Light" w:cs="Archivo Light"/>
+            </w:rPr>
+          </w:pPr>
+          <w:r>
+            <w:rPr>
+              <w:rFonts w:ascii="Archivo Light" w:hAnsi="Archivo Light" w:cs="Archivo Light"/>
+            </w:rPr>
+            <w:t>{calificacion_indicador_14_ultimo_periodo}</w:t>
+          </w:r>
+        </w:p>
+        <w:p>
+          <w:pPr>
+            <w:spacing w:before="320" w:after="320" w:line="360" w:lineRule="auto"/>
+            <w:ind w:right="616"/>
+            <w:jc w:val="both"/>
+            <w:rPr>
+              <w:rFonts w:ascii="Archivo Light" w:hAnsi="Archivo Light" w:cs="Archivo Light"/>
+            </w:rPr>
+          </w:pPr>
+          <w:r>
+            <w:rPr>
+              <w:rFonts w:ascii="Archivo Light" w:hAnsi="Archivo Light" w:cs="Archivo Light"/>
+            </w:rPr>
             <w:t>{analisis_indicador_14}</w:t>
           </w:r>
         </w:p>
@@ -3470,6 +4021,38 @@
             <w:rPr>
               <w:rFonts w:ascii="Archivo Light" w:hAnsi="Archivo Light" w:cs="Archivo Light"/>
             </w:rPr>
+            <w:t>{calificacion_indicador_15_general}</w:t>
+          </w:r>
+        </w:p>
+        <w:p>
+          <w:pPr>
+            <w:spacing w:before="320" w:after="320" w:line="360" w:lineRule="auto"/>
+            <w:ind w:right="616"/>
+            <w:jc w:val="both"/>
+            <w:rPr>
+              <w:rFonts w:ascii="Archivo Light" w:hAnsi="Archivo Light" w:cs="Archivo Light"/>
+            </w:rPr>
+          </w:pPr>
+          <w:r>
+            <w:rPr>
+              <w:rFonts w:ascii="Archivo Light" w:hAnsi="Archivo Light" w:cs="Archivo Light"/>
+            </w:rPr>
+            <w:t>{calificacion_indicador_15_ultimo_periodo}</w:t>
+          </w:r>
+        </w:p>
+        <w:p>
+          <w:pPr>
+            <w:spacing w:before="320" w:after="320" w:line="360" w:lineRule="auto"/>
+            <w:ind w:right="616"/>
+            <w:jc w:val="both"/>
+            <w:rPr>
+              <w:rFonts w:ascii="Archivo Light" w:hAnsi="Archivo Light" w:cs="Archivo Light"/>
+            </w:rPr>
+          </w:pPr>
+          <w:r>
+            <w:rPr>
+              <w:rFonts w:ascii="Archivo Light" w:hAnsi="Archivo Light" w:cs="Archivo Light"/>
+            </w:rPr>
             <w:t>{analisis_indicador_15}</w:t>
           </w:r>
         </w:p>
@@ -3575,6 +4158,38 @@
             <w:rPr>
               <w:rFonts w:ascii="Archivo Light" w:hAnsi="Archivo Light" w:cs="Archivo Light"/>
             </w:rPr>
+            <w:t>{calificacion_indicador_16_general}</w:t>
+          </w:r>
+        </w:p>
+        <w:p>
+          <w:pPr>
+            <w:spacing w:before="320" w:after="320" w:line="360" w:lineRule="auto"/>
+            <w:ind w:right="616"/>
+            <w:jc w:val="both"/>
+            <w:rPr>
+              <w:rFonts w:ascii="Archivo Light" w:hAnsi="Archivo Light" w:cs="Archivo Light"/>
+            </w:rPr>
+          </w:pPr>
+          <w:r>
+            <w:rPr>
+              <w:rFonts w:ascii="Archivo Light" w:hAnsi="Archivo Light" w:cs="Archivo Light"/>
+            </w:rPr>
+            <w:t>{calificacion_indicador_16_ultimo_periodo}</w:t>
+          </w:r>
+        </w:p>
+        <w:p>
+          <w:pPr>
+            <w:spacing w:before="320" w:after="320" w:line="360" w:lineRule="auto"/>
+            <w:ind w:right="616"/>
+            <w:jc w:val="both"/>
+            <w:rPr>
+              <w:rFonts w:ascii="Archivo Light" w:hAnsi="Archivo Light" w:cs="Archivo Light"/>
+            </w:rPr>
+          </w:pPr>
+          <w:r>
+            <w:rPr>
+              <w:rFonts w:ascii="Archivo Light" w:hAnsi="Archivo Light" w:cs="Archivo Light"/>
+            </w:rPr>
             <w:t>{analisis_indicador_16}</w:t>
           </w:r>
         </w:p>
@@ -3884,6 +4499,38 @@
             <w:rPr>
               <w:rFonts w:ascii="Archivo Light" w:hAnsi="Archivo Light" w:cs="Archivo Light"/>
             </w:rPr>
+            <w:t>{calificacion_indicador_17_general}</w:t>
+          </w:r>
+        </w:p>
+        <w:p>
+          <w:pPr>
+            <w:spacing w:before="320" w:after="320" w:line="360" w:lineRule="auto"/>
+            <w:ind w:right="616"/>
+            <w:jc w:val="both"/>
+            <w:rPr>
+              <w:rFonts w:ascii="Archivo Light" w:hAnsi="Archivo Light" w:cs="Archivo Light"/>
+            </w:rPr>
+          </w:pPr>
+          <w:r>
+            <w:rPr>
+              <w:rFonts w:ascii="Archivo Light" w:hAnsi="Archivo Light" w:cs="Archivo Light"/>
+            </w:rPr>
+            <w:t>{calificacion_indicador_17_ultimo_periodo}</w:t>
+          </w:r>
+        </w:p>
+        <w:p>
+          <w:pPr>
+            <w:spacing w:before="320" w:after="320" w:line="360" w:lineRule="auto"/>
+            <w:ind w:right="616"/>
+            <w:jc w:val="both"/>
+            <w:rPr>
+              <w:rFonts w:ascii="Archivo Light" w:hAnsi="Archivo Light" w:cs="Archivo Light"/>
+            </w:rPr>
+          </w:pPr>
+          <w:r>
+            <w:rPr>
+              <w:rFonts w:ascii="Archivo Light" w:hAnsi="Archivo Light" w:cs="Archivo Light"/>
+            </w:rPr>
             <w:t>{analisis_indicador_17}</w:t>
           </w:r>
         </w:p>
@@ -3994,6 +4641,38 @@
         <w:alias w:val="Bloque 98 del machote original"/>
       </w:sdtPr>
       <w:sdtContent>
+        <w:p>
+          <w:pPr>
+            <w:spacing w:before="320" w:after="320" w:line="360" w:lineRule="auto"/>
+            <w:ind w:right="616"/>
+            <w:jc w:val="both"/>
+            <w:rPr>
+              <w:rFonts w:ascii="Archivo Light" w:hAnsi="Archivo Light" w:cs="Archivo Light"/>
+            </w:rPr>
+          </w:pPr>
+          <w:r>
+            <w:rPr>
+              <w:rFonts w:ascii="Archivo Light" w:hAnsi="Archivo Light" w:cs="Archivo Light"/>
+            </w:rPr>
+            <w:t>{calificacion_indicador_18_general}</w:t>
+          </w:r>
+        </w:p>
+        <w:p>
+          <w:pPr>
+            <w:spacing w:before="320" w:after="320" w:line="360" w:lineRule="auto"/>
+            <w:ind w:right="616"/>
+            <w:jc w:val="both"/>
+            <w:rPr>
+              <w:rFonts w:ascii="Archivo Light" w:hAnsi="Archivo Light" w:cs="Archivo Light"/>
+            </w:rPr>
+          </w:pPr>
+          <w:r>
+            <w:rPr>
+              <w:rFonts w:ascii="Archivo Light" w:hAnsi="Archivo Light" w:cs="Archivo Light"/>
+            </w:rPr>
+            <w:t>{calificacion_indicador_18_ultimo_periodo}</w:t>
+          </w:r>
+        </w:p>
         <w:p>
           <w:pPr>
             <w:spacing w:before="320" w:after="320" w:line="360" w:lineRule="auto"/>

</xml_diff>